<commit_message>
feat: implement SPI flash memory driver and documentation for multi-network RF isolation via NET_ID
</commit_message>
<xml_diff>
--- a/docs/QuyTrinh_Test_RF_Link_MBW_RF24.docx
+++ b/docs/QuyTrinh_Test_RF_Link_MBW_RF24.docx
@@ -2588,7 +2588,7 @@
                 <w:sz w:val="21"/>
                 <w:szCs w:val="21"/>
               </w:rPr>
-              <w:t xml:space="preserve">PASS 8/8 bước (id, dip, flash, rtc, loopback, rf id, RF heartbeat, RF khung mất)</w:t>
+              <w:t xml:space="preserve">PASS 7/7 bước (id, dip, flash, rtc, rf id, RF heartbeat, RF khung mất) + kiểm RS485 thủ công qua forward</w:t>
             </w:r>
           </w:p>
         </w:tc>
@@ -2983,7 +2983,7 @@
           <w:sz w:val="22"/>
           <w:szCs w:val="22"/>
         </w:rPr>
-        <w:t xml:space="preserve">Chuẩn bị: nối tắt A–B đầu RS485 (cho bước loopback); board mẫu thứ 2 cùng NETID bật nguồn trong tầm sóng (cho 2 bước RF); kết nối cổng console, bấm Run Test ở tab Factory Test.</w:t>
+        <w:t xml:space="preserve">Chuẩn bị: board mẫu thứ 2 cùng NETID bật nguồn trong tầm sóng (cho 2 bước RF); kết nối cổng console, bấm Run Test ở tab Factory Test.</w:t>
       </w:r>
     </w:p>
     <w:p>
@@ -3021,7 +3021,7 @@
           <w:sz w:val="22"/>
           <w:szCs w:val="22"/>
         </w:rPr>
-        <w:t xml:space="preserve">Đạt: 8/8 PASS → Export Report (ghi nối tiếp mbw_test_report.xlsx). Bất kỳ bước FAIL → board không xuất xưởng.</w:t>
+        <w:t xml:space="preserve">Đạt: 7/7 PASS → kiểm RS485 THỦ CÔNG bằng chức năng forward: gõ text vào ô “Gửi thử lên RS485” (tab Giám sát Forward), board mẫu đối diện phải nhận được khung (dòng FWD RF→RS485 bên kia); hoặc đấu Modbus Master qua cổng RS485 thật và xem khung OK chạy trên bảng. Xong → Export Report. Bất kỳ bước FAIL → board không xuất xưởng.</w:t>
       </w:r>
     </w:p>
     <w:p>

</xml_diff>